<commit_message>
data(storms) + fix fig
</commit_message>
<xml_diff>
--- a/rmarkdown-debugging/Debugged_Document.docx
+++ b/rmarkdown-debugging/Debugged_Document.docx
@@ -61,7 +61,7 @@
         <w:t>Debugged_Document.docx</w:t>
       </w:r>
       <w:r>
-        <w:t xml:space="preserve">. Below is the workflow to do so, </w:t>
+        <w:t xml:space="preserve">. Here is the workflow to do so, </w:t>
       </w:r>
       <w:r>
         <w:rPr>
@@ -129,7 +129,13 @@
         <w:t>6 fixes</w:t>
       </w:r>
       <w:r>
-        <w:t xml:space="preserve"> you need to make to the workflow below. To complete this assignment you must identify the 5 errors and specify what they are.</w:t>
+        <w:t xml:space="preserve"> you need to make to the workflow below. To complete this assignment you must identify the </w:t>
+      </w:r>
+      <w:r>
+        <w:t>6</w:t>
+      </w:r>
+      <w:r>
+        <w:t xml:space="preserve"> errors and specify what they are.</w:t>
       </w:r>
     </w:p>
     <w:p>
@@ -230,10 +236,10 @@
         <w:rPr>
           <w:rStyle w:val="VerbatimChar"/>
         </w:rPr>
-        <w:t>atlantic_storms.csv</w:t>
-      </w:r>
-      <w:r>
-        <w:t xml:space="preserve"> file in the data folder for this lesson. This dataset is based on the NOAA Atlantic hurricane database (</w:t>
+        <w:t>storms</w:t>
+      </w:r>
+      <w:r>
+        <w:t xml:space="preserve"> data from the {dplyr} package. This dataset is based on the NOAA Atlantic hurricane database (</w:t>
       </w:r>
       <w:hyperlink r:id="rId5" w:anchor="hurdat">
         <w:r>
@@ -244,13 +250,13 @@
         </w:r>
       </w:hyperlink>
       <w:r>
-        <w:t xml:space="preserve">). The data includes storm tracks of storms from 1975-2021, as well as some characteristics (like wind and air pressure) during their progression. Storms from 1979 onward are measured every six hours during the lifetime of the storm. Storms in earlier years have some missing data. Descriptions of each variable in the dataset can be found in </w:t>
-      </w:r>
-      <w:r>
-        <w:rPr>
-          <w:rStyle w:val="VerbatimChar"/>
-        </w:rPr>
-        <w:t>data/atlantic_storms_desc.txt</w:t>
+        <w:t xml:space="preserve">). The data includes storm tracks of storms from 1975-2022, as well as some characteristics (like wind and air pressure) during their progression. Storms from 1979 onward are measured every six hours during the lifetime of the storm. Storms in earlier years have some missing data. Descriptions of each variable in the dataset can be found with </w:t>
+      </w:r>
+      <w:r>
+        <w:rPr>
+          <w:rStyle w:val="VerbatimChar"/>
+        </w:rPr>
+        <w:t>?storms</w:t>
       </w:r>
       <w:r>
         <w:t>.</w:t>
@@ -272,62 +278,62 @@
         <w:rPr>
           <w:rStyle w:val="VerbatimChar"/>
         </w:rPr>
+        <w:t xml:space="preserve">##         name            year          month             day       </w:t>
+      </w:r>
+      <w:r>
+        <w:br/>
+      </w:r>
+      <w:r>
+        <w:rPr>
+          <w:rStyle w:val="VerbatimChar"/>
+        </w:rPr>
+        <w:t xml:space="preserve">##  Length   :20778   Min.   :1975   Min.   : 1.000   Min.   : 1.00  </w:t>
+      </w:r>
+      <w:r>
+        <w:br/>
+      </w:r>
+      <w:r>
+        <w:rPr>
+          <w:rStyle w:val="VerbatimChar"/>
+        </w:rPr>
         <w:lastRenderedPageBreak/>
-        <w:t xml:space="preserve">##         name            year          month             day       </w:t>
-      </w:r>
-      <w:r>
-        <w:br/>
-      </w:r>
-      <w:r>
-        <w:rPr>
-          <w:rStyle w:val="VerbatimChar"/>
-        </w:rPr>
-        <w:t xml:space="preserve">##  Length   :19066   Min.   :1975   Min.   : 1.000   Min.   : 1.00  </w:t>
-      </w:r>
-      <w:r>
-        <w:br/>
-      </w:r>
-      <w:r>
-        <w:rPr>
-          <w:rStyle w:val="VerbatimChar"/>
-        </w:rPr>
-        <w:t xml:space="preserve">##  N.unique :  258   1st Qu.:1993   1st Qu.: 8.000   1st Qu.: 8.00  </w:t>
-      </w:r>
-      <w:r>
-        <w:br/>
-      </w:r>
-      <w:r>
-        <w:rPr>
-          <w:rStyle w:val="VerbatimChar"/>
-        </w:rPr>
-        <w:t xml:space="preserve">##  N.blank  :    0   Median :2004   Median : 9.000   Median :16.00  </w:t>
-      </w:r>
-      <w:r>
-        <w:br/>
-      </w:r>
-      <w:r>
-        <w:rPr>
-          <w:rStyle w:val="VerbatimChar"/>
-        </w:rPr>
-        <w:t xml:space="preserve">##  Min.nchar:    3   Mean   :2002   Mean   : 8.699   Mean   :15.78  </w:t>
-      </w:r>
-      <w:r>
-        <w:br/>
-      </w:r>
-      <w:r>
-        <w:rPr>
-          <w:rStyle w:val="VerbatimChar"/>
-        </w:rPr>
-        <w:t xml:space="preserve">##  Max.nchar:    9   3rd Qu.:2012   3rd Qu.: 9.000   3rd Qu.:24.00  </w:t>
-      </w:r>
-      <w:r>
-        <w:br/>
-      </w:r>
-      <w:r>
-        <w:rPr>
-          <w:rStyle w:val="VerbatimChar"/>
-        </w:rPr>
-        <w:t xml:space="preserve">##                    Max.   :2021   Max.   :12.000   Max.   :31.00  </w:t>
+        <w:t xml:space="preserve">##  N.unique :  268   1st Qu.:1995   1st Qu.: 8.000   1st Qu.: 8.00  </w:t>
+      </w:r>
+      <w:r>
+        <w:br/>
+      </w:r>
+      <w:r>
+        <w:rPr>
+          <w:rStyle w:val="VerbatimChar"/>
+        </w:rPr>
+        <w:t xml:space="preserve">##  N.blank  :    0   Median :2005   Median : 9.000   Median :16.00  </w:t>
+      </w:r>
+      <w:r>
+        <w:br/>
+      </w:r>
+      <w:r>
+        <w:rPr>
+          <w:rStyle w:val="VerbatimChar"/>
+        </w:rPr>
+        <w:t xml:space="preserve">##  Min.nchar:    3   Mean   :2004   Mean   : 8.708   Mean   :15.71  </w:t>
+      </w:r>
+      <w:r>
+        <w:br/>
+      </w:r>
+      <w:r>
+        <w:rPr>
+          <w:rStyle w:val="VerbatimChar"/>
+        </w:rPr>
+        <w:t xml:space="preserve">##  Max.nchar:   10   3rd Qu.:2016   3rd Qu.: 9.000   3rd Qu.:24.00  </w:t>
+      </w:r>
+      <w:r>
+        <w:br/>
+      </w:r>
+      <w:r>
+        <w:rPr>
+          <w:rStyle w:val="VerbatimChar"/>
+        </w:rPr>
+        <w:t xml:space="preserve">##                    Max.   :2024   Max.   :12.000   Max.   :31.00  </w:t>
       </w:r>
       <w:r>
         <w:br/>
@@ -345,70 +351,70 @@
         <w:rPr>
           <w:rStyle w:val="VerbatimChar"/>
         </w:rPr>
-        <w:t xml:space="preserve">##       hour             lat             long               status     </w:t>
-      </w:r>
-      <w:r>
-        <w:br/>
-      </w:r>
-      <w:r>
-        <w:rPr>
-          <w:rStyle w:val="VerbatimChar"/>
-        </w:rPr>
-        <w:t xml:space="preserve">##  Min.   : 0.000   Min.   : 7.00   Min.   :-109.30   Length   :19066  </w:t>
-      </w:r>
-      <w:r>
-        <w:br/>
-      </w:r>
-      <w:r>
-        <w:rPr>
-          <w:rStyle w:val="VerbatimChar"/>
-        </w:rPr>
-        <w:t xml:space="preserve">##  1st Qu.: 5.000   1st Qu.:18.40   1st Qu.: -78.70   N.unique :    9  </w:t>
-      </w:r>
-      <w:r>
-        <w:br/>
-      </w:r>
-      <w:r>
-        <w:rPr>
-          <w:rStyle w:val="VerbatimChar"/>
-        </w:rPr>
-        <w:t xml:space="preserve">##  Median :12.000   Median :26.60   Median : -62.25   N.blank  :    0  </w:t>
-      </w:r>
-      <w:r>
-        <w:br/>
-      </w:r>
-      <w:r>
-        <w:rPr>
-          <w:rStyle w:val="VerbatimChar"/>
-        </w:rPr>
-        <w:t xml:space="preserve">##  Mean   : 9.094   Mean   :26.99   Mean   : -61.52   Min.nchar:    9  </w:t>
-      </w:r>
-      <w:r>
-        <w:br/>
-      </w:r>
-      <w:r>
-        <w:rPr>
-          <w:rStyle w:val="VerbatimChar"/>
-        </w:rPr>
-        <w:t xml:space="preserve">##  3rd Qu.:18.000   3rd Qu.:33.70   3rd Qu.: -45.60   Max.nchar:   22  </w:t>
-      </w:r>
-      <w:r>
-        <w:br/>
-      </w:r>
-      <w:r>
-        <w:rPr>
-          <w:rStyle w:val="VerbatimChar"/>
-        </w:rPr>
-        <w:t xml:space="preserve">##  Max.   :23.000   Max.   :70.70   Max.   :  13.50                    </w:t>
-      </w:r>
-      <w:r>
-        <w:br/>
-      </w:r>
-      <w:r>
-        <w:rPr>
-          <w:rStyle w:val="VerbatimChar"/>
-        </w:rPr>
-        <w:t xml:space="preserve">##                                                                      </w:t>
+        <w:t xml:space="preserve">##       hour             lat             long                         status    </w:t>
+      </w:r>
+      <w:r>
+        <w:br/>
+      </w:r>
+      <w:r>
+        <w:rPr>
+          <w:rStyle w:val="VerbatimChar"/>
+        </w:rPr>
+        <w:t xml:space="preserve">##  Min.   : 0.000   Min.   : 7.00   Min.   :-136.90   tropical storm     :7252  </w:t>
+      </w:r>
+      <w:r>
+        <w:br/>
+      </w:r>
+      <w:r>
+        <w:rPr>
+          <w:rStyle w:val="VerbatimChar"/>
+        </w:rPr>
+        <w:t xml:space="preserve">##  1st Qu.: 5.000   1st Qu.:18.30   1st Qu.: -78.60   hurricane          :5100  </w:t>
+      </w:r>
+      <w:r>
+        <w:br/>
+      </w:r>
+      <w:r>
+        <w:rPr>
+          <w:rStyle w:val="VerbatimChar"/>
+        </w:rPr>
+        <w:t xml:space="preserve">##  Median :12.000   Median :26.40   Median : -61.90   tropical depression:3685  </w:t>
+      </w:r>
+      <w:r>
+        <w:br/>
+      </w:r>
+      <w:r>
+        <w:rPr>
+          <w:rStyle w:val="VerbatimChar"/>
+        </w:rPr>
+        <w:t xml:space="preserve">##  Mean   : 9.102   Mean   :26.94   Mean   : -61.32   extratropical      :2318  </w:t>
+      </w:r>
+      <w:r>
+        <w:br/>
+      </w:r>
+      <w:r>
+        <w:rPr>
+          <w:rStyle w:val="VerbatimChar"/>
+        </w:rPr>
+        <w:t xml:space="preserve">##  3rd Qu.:18.000   3rd Qu.:33.80   3rd Qu.: -45.30   other low          :1623  </w:t>
+      </w:r>
+      <w:r>
+        <w:br/>
+      </w:r>
+      <w:r>
+        <w:rPr>
+          <w:rStyle w:val="VerbatimChar"/>
+        </w:rPr>
+        <w:t xml:space="preserve">##  Max.   :23.000   Max.   :70.70   Max.   :  13.50   subtropical storm  : 323  </w:t>
+      </w:r>
+      <w:r>
+        <w:br/>
+      </w:r>
+      <w:r>
+        <w:rPr>
+          <w:rStyle w:val="VerbatimChar"/>
+        </w:rPr>
+        <w:t xml:space="preserve">##                                                     (Other)            : 477  </w:t>
       </w:r>
       <w:r>
         <w:br/>
@@ -435,25 +441,25 @@
         <w:rPr>
           <w:rStyle w:val="VerbatimChar"/>
         </w:rPr>
-        <w:t xml:space="preserve">##  1st Qu.:1.000   1st Qu.: 30.00   1st Qu.: 987.0   1st Qu.:   0.0              </w:t>
-      </w:r>
-      <w:r>
-        <w:br/>
-      </w:r>
-      <w:r>
-        <w:rPr>
-          <w:rStyle w:val="VerbatimChar"/>
-        </w:rPr>
-        <w:t xml:space="preserve">##  Median :1.000   Median : 45.00   Median :1000.0   Median : 110.0              </w:t>
-      </w:r>
-      <w:r>
-        <w:br/>
-      </w:r>
-      <w:r>
-        <w:rPr>
-          <w:rStyle w:val="VerbatimChar"/>
-        </w:rPr>
-        <w:t xml:space="preserve">##  Mean   :1.898   Mean   : 50.02   Mean   : 993.6   Mean   : 146.3              </w:t>
+        <w:t xml:space="preserve">##  1st Qu.:1.000   1st Qu.: 30.00   1st Qu.: 986.0   1st Qu.:   0.0              </w:t>
+      </w:r>
+      <w:r>
+        <w:br/>
+      </w:r>
+      <w:r>
+        <w:rPr>
+          <w:rStyle w:val="VerbatimChar"/>
+        </w:rPr>
+        <w:t xml:space="preserve">##  Median :1.000   Median : 45.00   Median :1000.0   Median : 120.0              </w:t>
+      </w:r>
+      <w:r>
+        <w:br/>
+      </w:r>
+      <w:r>
+        <w:rPr>
+          <w:rStyle w:val="VerbatimChar"/>
+        </w:rPr>
+        <w:t xml:space="preserve">##  Mean   :1.899   Mean   : 50.07   Mean   : 993.4   Mean   : 148.1              </w:t>
       </w:r>
       <w:r>
         <w:br/>
@@ -480,7 +486,7 @@
         <w:rPr>
           <w:rStyle w:val="VerbatimChar"/>
         </w:rPr>
-        <w:t xml:space="preserve">##  NAs    :14382                                     NAs    :9512                </w:t>
+        <w:t xml:space="preserve">##  NAs    :15678                                     NAs    :9512                </w:t>
       </w:r>
       <w:r>
         <w:br/>
@@ -525,7 +531,7 @@
         <w:rPr>
           <w:rStyle w:val="VerbatimChar"/>
         </w:rPr>
-        <w:t xml:space="preserve">##  Mean   : 14.81          </w:t>
+        <w:t xml:space="preserve">##  Mean   : 14.82          </w:t>
       </w:r>
       <w:r>
         <w:br/>
@@ -573,7 +579,7 @@
         </w:rPr>
         <w:lastRenderedPageBreak/>
         <w:drawing>
-          <wp:inline distT="0" distB="0" distL="0" distR="0" wp14:anchorId="1AEE9BE3" wp14:editId="4EDF0FC8">
+          <wp:inline distT="0" distB="0" distL="0" distR="0" wp14:anchorId="397C1A4A" wp14:editId="690957DB">
             <wp:extent cx="5334000" cy="4267200"/>
             <wp:effectExtent l="0" t="0" r="0" b="0"/>
             <wp:docPr id="11" name="Picture"/>
@@ -643,7 +649,7 @@
         </w:rPr>
         <w:lastRenderedPageBreak/>
         <w:drawing>
-          <wp:inline distT="0" distB="0" distL="0" distR="0" wp14:anchorId="5E6D4DF6" wp14:editId="2254BC32">
+          <wp:inline distT="0" distB="0" distL="0" distR="0" wp14:anchorId="267C57A2" wp14:editId="0B3AAAFC">
             <wp:extent cx="5334000" cy="4267200"/>
             <wp:effectExtent l="0" t="0" r="0" b="0"/>
             <wp:docPr id="14" name="Picture"/>
@@ -703,7 +709,7 @@
         </w:rPr>
         <w:lastRenderedPageBreak/>
         <w:drawing>
-          <wp:inline distT="0" distB="0" distL="0" distR="0" wp14:anchorId="27C49E3C" wp14:editId="3CF735FE">
+          <wp:inline distT="0" distB="0" distL="0" distR="0" wp14:anchorId="64BE43CF" wp14:editId="723C5A3A">
             <wp:extent cx="5334000" cy="4267200"/>
             <wp:effectExtent l="0" t="0" r="0" b="0"/>
             <wp:docPr id="17" name="Picture"/>
@@ -764,7 +770,7 @@
   <w:abstractNum w:abstractNumId="0" w15:restartNumberingAfterBreak="0">
     <w:nsid w:val="0000A990"/>
     <w:multiLevelType w:val="multilevel"/>
-    <w:tmpl w:val="C0621274"/>
+    <w:tmpl w:val="AE1274B4"/>
     <w:lvl w:ilvl="0">
       <w:numFmt w:val="bullet"/>
       <w:lvlText w:val=" "/>
@@ -841,7 +847,7 @@
   <w:abstractNum w:abstractNumId="1" w15:restartNumberingAfterBreak="0">
     <w:nsid w:val="00A99411"/>
     <w:multiLevelType w:val="multilevel"/>
-    <w:tmpl w:val="DC809996"/>
+    <w:tmpl w:val="034A7EDC"/>
     <w:lvl w:ilvl="0">
       <w:start w:val="1"/>
       <w:numFmt w:val="decimal"/>
@@ -924,10 +930,10 @@
       </w:pPr>
     </w:lvl>
   </w:abstractNum>
-  <w:num w:numId="1" w16cid:durableId="1974209127">
+  <w:num w:numId="1" w16cid:durableId="1796488813">
     <w:abstractNumId w:val="0"/>
   </w:num>
-  <w:num w:numId="2" w16cid:durableId="1971091557">
+  <w:num w:numId="2" w16cid:durableId="536164276">
     <w:abstractNumId w:val="1"/>
     <w:lvlOverride w:ilvl="0">
       <w:startOverride w:val="1"/>

</xml_diff>